<commit_message>
fix(attestations): date Rabat → date du jour + retrait du surlignage jaune
- Script scripts/fix-attestations-templates.mjs : remplace la date hardcodée
  à côté de « Rabat, le » par un placeholder {DATE_REDACTION} (résout l'éclatement
  de la date sur plusieurs <w:t> runs qui faisait échouer le remplacement string).
- Retire toutes les balises <w:highlight w:val="yellow"/> des modèles.
- hr.js : suppression des fixedDates devenues inutiles.

5 modèles corrigés : salaire, accuse, stage, travail_en_poste, travail_depart.

Co-Authored-By: Claude Opus 4.7 (1M context) <noreply@anthropic.com>
</commit_message>
<xml_diff>
--- a/public/hr_modeles/salaire_template.docx
+++ b/public/hr_modeles/salaire_template.docx
@@ -27,58 +27,7 @@
           <w:sz w:val="26"/>
           <w:lang w:val="fr-MA"/>
         </w:rPr>
-        <w:t>Rabat,  le 02</w:t>
-      </w:r>
-      <w:r>
-        <w:rPr>
-          <w:rFonts w:ascii="Comic Sans MS" w:hAnsi="Comic Sans MS" w:hint="cs"/>
-          <w:sz w:val="26"/>
-          <w:rtl/>
-          <w:lang w:val="fr-MA"/>
-        </w:rPr>
-        <w:t xml:space="preserve"> </w:t>
-      </w:r>
-      <w:r>
-        <w:rPr>
-          <w:rFonts w:ascii="Comic Sans MS" w:hAnsi="Comic Sans MS"/>
-          <w:sz w:val="26"/>
-          <w:lang w:val="fr-MA"/>
-        </w:rPr>
-        <w:t>/03</w:t>
-      </w:r>
-      <w:r>
-        <w:rPr>
-          <w:rFonts w:ascii="Comic Sans MS" w:hAnsi="Comic Sans MS" w:hint="cs"/>
-          <w:sz w:val="26"/>
-          <w:rtl/>
-          <w:lang w:val="fr-MA"/>
-        </w:rPr>
-        <w:t xml:space="preserve"> </w:t>
-      </w:r>
-      <w:r>
-        <w:rPr>
-          <w:rFonts w:ascii="Comic Sans MS" w:hAnsi="Comic Sans MS"/>
-          <w:sz w:val="26"/>
-          <w:lang w:val="fr-MA"/>
-        </w:rPr>
-        <w:t>/20</w:t>
-      </w:r>
-      <w:r>
-        <w:rPr>
-          <w:rFonts w:ascii="Comic Sans MS" w:hAnsi="Comic Sans MS" w:hint="cs"/>
-          <w:sz w:val="26"/>
-          <w:rtl/>
-          <w:lang w:val="fr-MA"/>
-        </w:rPr>
-        <w:t>2</w:t>
-      </w:r>
-      <w:r>
-        <w:rPr>
-          <w:rFonts w:ascii="Comic Sans MS" w:hAnsi="Comic Sans MS"/>
-          <w:sz w:val="26"/>
-          <w:lang w:val="fr-MA"/>
-        </w:rPr>
-        <w:t>6</w:t>
+        <w:t xml:space="preserve">Rabat, le {DATE_REDACTION}</w:t>
       </w:r>
     </w:p>
     <w:p>
@@ -223,7 +172,6 @@
         <w:rPr>
           <w:rFonts w:ascii="Comic Sans MS" w:hAnsi="Comic Sans MS"/>
           <w:sz w:val="26"/>
-          <w:highlight w:val="yellow"/>
         </w:rPr>
         <w:t>{NOM}</w:t>
       </w:r>
@@ -256,7 +204,6 @@
         <w:rPr>
           <w:rFonts w:ascii="Comic Sans MS" w:hAnsi="Comic Sans MS"/>
           <w:sz w:val="26"/>
-          <w:highlight w:val="yellow"/>
         </w:rPr>
         <w:t>{CNSS}</w:t>
       </w:r>
@@ -271,7 +218,6 @@
         <w:rPr>
           <w:rFonts w:ascii="Comic Sans MS" w:hAnsi="Comic Sans MS"/>
           <w:sz w:val="26"/>
-          <w:highlight w:val="yellow"/>
         </w:rPr>
         <w:t>{SALAIRE}</w:t>
       </w:r>

</xml_diff>

<commit_message>
checkpoint: lien OCP + refonte Devis internet/Commandes + travaux en cours déjà en prod
Sauvegarde de tout l'état actuel (rien n'était commité depuis longtemps, tout est déjà déployé).

Principales nouveautés récentes :
- Lien OCP : recherche dans TOUS les produits Odoo, masquage de variantes (tailles/parfums)
  par produit, photos « à la main » par article (coller/fichier/URL, redimensionnées),
  image par défaut framboise/figue/prune.
- Devis : séparation « Devis internet » (uniquement non traités) / « Commandes »
  (confirmées + devis internet traités). Bascule dès qu'un n° S est cité dans une
  conversation WhatsApp, relancé (📤) ou confirmé.
- Nombreux autres chantiers en cours déjà en prod (conversations, recap, HR, caisse,
  livraisons, prévisions vitrine, planning cake design, règlement intérieur, etc.).

Co-Authored-By: Claude Opus 4.8 (1M context) <noreply@anthropic.com>
</commit_message>
<xml_diff>
--- a/public/hr_modeles/salaire_template.docx
+++ b/public/hr_modeles/salaire_template.docx
@@ -4,17 +4,7 @@
   <w:body>
     <w:p>
       <w:pPr>
-        <w:ind w:left="5040"/>
-        <w:rPr>
-          <w:rFonts w:ascii="Comic Sans MS" w:hAnsi="Comic Sans MS"/>
-          <w:sz w:val="26"/>
-          <w:lang w:val="fr-MA"/>
-        </w:rPr>
-      </w:pPr>
-    </w:p>
-    <w:p>
-      <w:pPr>
-        <w:ind w:left="5040"/>
+        <w:ind w:left="4320"/>
         <w:rPr>
           <w:rFonts w:ascii="Comic Sans MS" w:hAnsi="Comic Sans MS"/>
           <w:sz w:val="26"/>
@@ -27,7 +17,7 @@
           <w:sz w:val="26"/>
           <w:lang w:val="fr-MA"/>
         </w:rPr>
-        <w:t xml:space="preserve">Rabat, le {DATE_REDACTION}</w:t>
+        <w:t>Rabat, le {DATE_REDACTION}</w:t>
       </w:r>
     </w:p>
     <w:p>
@@ -157,6 +147,8 @@
         <w:pStyle w:val="p1"/>
         <w:rPr>
           <w:rFonts w:ascii="Comic Sans MS" w:hAnsi="Comic Sans MS"/>
+          <w:b/>
+          <w:bCs/>
           <w:sz w:val="26"/>
         </w:rPr>
       </w:pPr>
@@ -166,13 +158,13 @@
           <w:sz w:val="26"/>
         </w:rPr>
         <w:t xml:space="preserve">                              </w:t>
-        <w:tab/>
       </w:r>
       <w:r>
         <w:rPr>
           <w:rFonts w:ascii="Comic Sans MS" w:hAnsi="Comic Sans MS"/>
           <w:sz w:val="26"/>
         </w:rPr>
+        <w:tab/>
         <w:t>{NOM}</w:t>
       </w:r>
       <w:r>
@@ -193,40 +185,21 @@
           <w:sz w:val="26"/>
         </w:rPr>
       </w:pPr>
+    </w:p>
+    <w:p>
+      <w:pPr>
+        <w:pStyle w:val="p1"/>
+        <w:rPr>
+          <w:rFonts w:ascii="Comic Sans MS" w:hAnsi="Comic Sans MS"/>
+          <w:sz w:val="26"/>
+        </w:rPr>
+      </w:pPr>
       <w:r>
         <w:rPr>
           <w:rFonts w:ascii="Comic Sans MS" w:hAnsi="Comic Sans MS"/>
           <w:sz w:val="26"/>
         </w:rPr>
-        <w:t xml:space="preserve">Titulaire de la CNSS numéro </w:t>
-      </w:r>
-      <w:r>
-        <w:rPr>
-          <w:rFonts w:ascii="Comic Sans MS" w:hAnsi="Comic Sans MS"/>
-          <w:sz w:val="26"/>
-        </w:rPr>
-        <w:t>{CNSS}</w:t>
-      </w:r>
-      <w:r>
-        <w:rPr>
-          <w:rFonts w:ascii="Comic Sans MS" w:hAnsi="Comic Sans MS"/>
-          <w:sz w:val="26"/>
-        </w:rPr>
-        <w:t xml:space="preserve">, perçoit un salaire net mensuel de </w:t>
-      </w:r>
-      <w:r>
-        <w:rPr>
-          <w:rFonts w:ascii="Comic Sans MS" w:hAnsi="Comic Sans MS"/>
-          <w:sz w:val="26"/>
-        </w:rPr>
-        <w:t>{SALAIRE}</w:t>
-      </w:r>
-      <w:r>
-        <w:rPr>
-          <w:rFonts w:ascii="Comic Sans MS" w:hAnsi="Comic Sans MS"/>
-          <w:sz w:val="26"/>
-        </w:rPr>
-        <w:t xml:space="preserve"> dh.</w:t>
+        <w:t>Titulaire de la CNSS numéro {CNSS}, perçoit un salaire net mensuel de {SALAIRE} dh.</w:t>
       </w:r>
     </w:p>
     <w:p>
@@ -303,36 +276,6 @@
     </w:p>
     <w:p>
       <w:pPr>
-        <w:ind w:left="4956"/>
-        <w:jc w:val="both"/>
-        <w:rPr>
-          <w:rFonts w:ascii="Comic Sans MS" w:hAnsi="Comic Sans MS"/>
-          <w:b/>
-          <w:bCs/>
-          <w:sz w:val="26"/>
-          <w:lang w:val="fr-MA"/>
-        </w:rPr>
-      </w:pPr>
-    </w:p>
-    <w:p>
-      <w:pPr>
-        <w:ind w:left="5040"/>
-        <w:rPr>
-          <w:lang w:val="fr-MA"/>
-        </w:rPr>
-      </w:pPr>
-      <w:r>
-        <w:rPr>
-          <w:rFonts w:ascii="Comic Sans MS" w:hAnsi="Comic Sans MS"/>
-          <w:sz w:val="26"/>
-          <w:lang w:val="fr-MA"/>
-        </w:rPr>
-        <w:br w:type="page"/>
-      </w:r>
-    </w:p>
-    <w:p>
-      <w:pPr>
-        <w:jc w:val="center"/>
         <w:rPr>
           <w:lang w:val="fr-MA"/>
         </w:rPr>

</xml_diff>